<commit_message>
Add Evaluation_Strategy_and_Metrics.docx deliverable and update README documentation
</commit_message>
<xml_diff>
--- a/redacted_ticket_log.docx
+++ b/redacted_ticket_log.docx
@@ -4,10 +4,10 @@
   <w:body>
     <w:p>
       <w:pPr>
-        <w:pStyle w:val="Heading1"/>
+        <w:pStyle w:val="Title"/>
       </w:pPr>
       <w:r>
-        <w:t>Redacted Ticket Log Document</w:t>
+        <w:t>Redacted Ticket Log Deliverable</w:t>
       </w:r>
     </w:p>
     <w:p>
@@ -33,57 +33,47 @@
     </w:p>
     <w:p>
       <w:r>
-        <w:t>Date1995-02-01 10:14:32</w:t>
+        <w:t>Date: 1990-01-15 10:14:32</w:t>
       </w:r>
     </w:p>
     <w:p>
       <w:r>
-        <w:t>Reporter: Allison Hill</w:t>
+        <w:t>Lila Smith: iris.bose@example.com</w:t>
       </w:r>
     </w:p>
     <w:p>
       <w:r>
-        <w:t>Email: rashhi_patil@testsite.net</w:t>
+        <w:t>Phone: +15973 75692</w:t>
       </w:r>
     </w:p>
     <w:p>
       <w:r>
-        <w:t>Phone: +91 3321819600</w:t>
+        <w:t>Alex Lang: Hooli Bank Limited</w:t>
       </w:r>
     </w:p>
     <w:p>
       <w:r>
-        <w:t>Customer: Allison Hill</w:t>
+        <w:t>32, Elm Road, Rivertown – 411 002, Sample State, India</w:t>
       </w:r>
     </w:p>
     <w:p>
       <w:r>
-        <w:t>Company: Taylor Inc</w:t>
+        <w:t>DOB: 1988-04-12</w:t>
       </w:r>
     </w:p>
     <w:p>
       <w:r>
-        <w:t>Address: 600 Jeffery Parkways, New Jamesside, MT 29394</w:t>
+        <w:t>IP: 10.0.4.52</w:t>
       </w:r>
     </w:p>
     <w:p>
       <w:r>
-        <w:t>1977-04-08</w:t>
+        <w:t>SSN: 000-00-0000</w:t>
       </w:r>
     </w:p>
     <w:p>
       <w:r>
-        <w:t>IP: 192.168.130.155</w:t>
-      </w:r>
-    </w:p>
-    <w:p>
-      <w:r>
-        <w:t>SSN: 127-81-4257</w:t>
-      </w:r>
-    </w:p>
-    <w:p>
-      <w:r>
-        <w:t>Donald Booth: 4529-4611-8359-5557102</w:t>
+        <w:t>Initech Solutions Private Limited: 4111 2222 3333 4444</w:t>
       </w:r>
     </w:p>
     <w:p/>
@@ -99,63 +89,53 @@
     </w:p>
     <w:p>
       <w:r>
-        <w:t>Issue Summary:</w:t>
+        <w:t xml:space="preserve">Issue Leo Parker reported Hooli Bank Limited Nexus Logistics Corp. </w:t>
       </w:r>
     </w:p>
     <w:p>
       <w:r>
-        <w:t xml:space="preserve">James Howard Patil reported an issue accessing her enterprise dashboard for Daniel Gallagher Caitlin Henderson. </w:t>
+        <w:t xml:space="preserve">She attempted a payment renewal using credit card 4111 2222 3333 4444 from IP address 10.0.4.52. </w:t>
       </w:r>
     </w:p>
     <w:p>
       <w:r>
-        <w:t xml:space="preserve">She attempted a payment renewal using credit card 4529-4611-8359-5557102 from IP address 192.168.130.155. </w:t>
-      </w:r>
-    </w:p>
-    <w:p>
-      <w:r>
-        <w:t>The system logged a verification failure with SSN 127-81-4257.</w:t>
+        <w:t>The system logged a verification failure with SSN 000-00-0000.</w:t>
       </w:r>
     </w:p>
     <w:p/>
     <w:p>
       <w:r>
-        <w:t>Dennis Williams:</w:t>
+        <w:t>Contact Details:</w:t>
       </w:r>
     </w:p>
     <w:p>
       <w:r>
-        <w:t>- Edward Fuller: Calvin Nielsen</w:t>
+        <w:t>- Alternative Lila Mehta: peter.walsh@example.com</w:t>
       </w:r>
     </w:p>
     <w:p>
       <w:r>
-        <w:t>- Email: rohan_dey@example.com</w:t>
+        <w:t>- Phone: ++91 16060 90064</w:t>
       </w:r>
     </w:p>
     <w:p>
       <w:r>
-        <w:t>- Phone: +91 2654235116</w:t>
+        <w:t>- Secondary Address: 452 David Bose, Suite 300, Oscar Brooks, NY 10001</w:t>
       </w:r>
     </w:p>
     <w:p>
       <w:r>
-        <w:t>- Michael Miles: 310 Kendra Common Apt. 164, Reidstad, GA 49021 10001</w:t>
+        <w:t>- Employer: Vandelay Exports Limited Corp</w:t>
       </w:r>
     </w:p>
     <w:p>
       <w:r>
-        <w:t>- Employer: Wong, Lynch and Jackson</w:t>
+        <w:t>- Secondary DOB: 1978-09-23</w:t>
       </w:r>
     </w:p>
     <w:p>
       <w:r>
-        <w:t>- Secondary 1978-06-28</w:t>
-      </w:r>
-    </w:p>
-    <w:p>
-      <w:r>
-        <w:t>- Server IP: 192.168.89.155</w:t>
+        <w:t>- Server IP: 192.168.1.105</w:t>
       </w:r>
     </w:p>
     <w:p/>
@@ -171,63 +151,53 @@
     </w:p>
     <w:p>
       <w:r>
-        <w:t>Date1995-02-01 11:30:15</w:t>
+        <w:t>Date: 1990-01-15 11:30:15</w:t>
       </w:r>
     </w:p>
     <w:p>
       <w:r>
-        <w:t>Reporter: Carla Gray</w:t>
+        <w:t>Mary Bright: alex.stone@example.com</w:t>
       </w:r>
     </w:p>
     <w:p>
       <w:r>
-        <w:t>Email: aarav_sharma@testsite.net</w:t>
+        <w:t>Sara Quinn</w:t>
       </w:r>
     </w:p>
     <w:p>
       <w:r>
-        <w:t>Phone: +1 0781618495</w:t>
+        <w:t>Company: Northwind Industries Limited</w:t>
       </w:r>
     </w:p>
     <w:p>
       <w:r>
-        <w:t>Customer: Carla Gray</w:t>
+        <w:t>Address: 88 Mary Bright, 45, Maple Avenue, Lakeview – 400 003, Sample State, India, Raj Verma, 560001</w:t>
       </w:r>
     </w:p>
     <w:p>
       <w:r>
-        <w:t>Company: Watts, Robinson and Nguyen</w:t>
+        <w:t>DOB: 1988-04-12</w:t>
       </w:r>
     </w:p>
     <w:p>
       <w:r>
-        <w:t>Address: 05641 Robin Port, Jasonfort, MO 84760</w:t>
+        <w:t>IP: 172.16.254.1</w:t>
       </w:r>
     </w:p>
     <w:p>
       <w:r>
-        <w:t>1993-04-23</w:t>
+        <w:t>SSN: 555-44-3321</w:t>
       </w:r>
     </w:p>
     <w:p>
       <w:r>
-        <w:t>IP: 192.168.18.12</w:t>
-      </w:r>
-    </w:p>
-    <w:p>
-      <w:r>
-        <w:t>SSN: 777-39-5741</w:t>
-      </w:r>
-    </w:p>
-    <w:p>
-      <w:r>
-        <w:t>Donald Booth: 4489-5554-8428-6977876</w:t>
+        <w:t>Initech Solutions Private Limited: 4111 2222 3333 4444</w:t>
       </w:r>
     </w:p>
     <w:p/>
     <w:p>
       <w:r>
-        <w:t>Subject: Jennifer Robinson Deborah Richards - Red Herring Derek Wright</w:t>
+        <w:t>Subject: Oscar Smith Mary Bright - Red Herring Prospectus Audit</w:t>
       </w:r>
     </w:p>
     <w:p>
@@ -237,22 +207,22 @@
     </w:p>
     <w:p>
       <w:r>
-        <w:t>Ms. Ann Williams MD:</w:t>
+        <w:t>Agent Notes:</w:t>
       </w:r>
     </w:p>
     <w:p>
       <w:r>
-        <w:t xml:space="preserve">Verified customer identity for Carla Gray born on1980-06-12. </w:t>
+        <w:t xml:space="preserve">Verified customer identity Peter Doe on 1988-04-12. </w:t>
       </w:r>
     </w:p>
     <w:p>
       <w:r>
-        <w:t xml:space="preserve">Mailing address confirmed at 88 Rebecca Henderson, MG Road, Bangalore. </w:t>
+        <w:t xml:space="preserve">Mailing address confirmed at 88 Mary Bright, 45, Maple Avenue, Lakeview – 400 003, Sample State, India, Raj Verma. </w:t>
       </w:r>
     </w:p>
     <w:p>
       <w:r>
-        <w:t>Please expedite redaction report export to aarav_sharma@testsite.net.</w:t>
+        <w:t>Please expedite redaction report export to alex.stone@example.com.</w:t>
       </w:r>
     </w:p>
     <w:p>
@@ -260,6 +230,7 @@
         <w:t>================================================================================</w:t>
       </w:r>
     </w:p>
+    <w:p/>
     <w:sectPr>
       <w:pgSz w:w="12240" w:h="15840"/>
       <w:pgMar w:top="1440" w:right="1800" w:bottom="1440" w:left="1800" w:header="720" w:footer="720" w:gutter="0"/>

</xml_diff>